<commit_message>
docs: use supplied White-Gloss logo and record confirmed VAT rate
</commit_message>
<xml_diff>
--- a/docs/bitrix/templates/buchungsbestaetigung.docx
+++ b/docs/bitrix/templates/buchungsbestaetigung.docx
@@ -4,12 +4,13 @@
   <w:body>
     <w:p>
       <w:pPr>
-        <w:jc w:val="right"/>
+        <w:jc w:val="center"/>
+        <w:shd w:fill="111111"/>
       </w:pPr>
       <w:r>
         <w:drawing>
           <wp:inline xmlns:a="http://schemas.openxmlformats.org/drawingml/2006/main" xmlns:pic="http://schemas.openxmlformats.org/drawingml/2006/picture">
-            <wp:extent cx="960120" cy="960120"/>
+            <wp:extent cx="2286000" cy="1479788"/>
             <wp:docPr id="1" name="Picture 1"/>
             <wp:cNvGraphicFramePr>
               <a:graphicFrameLocks noChangeAspect="1"/>
@@ -30,7 +31,7 @@
                   <pic:spPr>
                     <a:xfrm>
                       <a:off x="0" y="0"/>
-                      <a:ext cx="960120" cy="960120"/>
+                      <a:ext cx="2286000" cy="1479788"/>
                     </a:xfrm>
                     <a:prstGeom prst="rect"/>
                   </pic:spPr>

</xml_diff>

<commit_message>
docs: align confirmation and invoice templates with supplied business stationery
</commit_message>
<xml_diff>
--- a/docs/bitrix/templates/buchungsbestaetigung.docx
+++ b/docs/bitrix/templates/buchungsbestaetigung.docx
@@ -2,128 +2,345 @@
 <file path=word/document.xml><?xml version="1.0" encoding="utf-8"?>
 <w:document xmlns:wpc="http://schemas.microsoft.com/office/word/2010/wordprocessingCanvas" xmlns:mo="http://schemas.microsoft.com/office/mac/office/2008/main" xmlns:mc="http://schemas.openxmlformats.org/markup-compatibility/2006" xmlns:mv="urn:schemas-microsoft-com:mac:vml" xmlns:o="urn:schemas-microsoft-com:office:office" xmlns:r="http://schemas.openxmlformats.org/officeDocument/2006/relationships" xmlns:m="http://schemas.openxmlformats.org/officeDocument/2006/math" xmlns:v="urn:schemas-microsoft-com:vml" xmlns:wp14="http://schemas.microsoft.com/office/word/2010/wordprocessingDrawing" xmlns:wp="http://schemas.openxmlformats.org/drawingml/2006/wordprocessingDrawing" xmlns:w10="urn:schemas-microsoft-com:office:word" xmlns:w="http://schemas.openxmlformats.org/wordprocessingml/2006/main" xmlns:w14="http://schemas.microsoft.com/office/word/2010/wordml" xmlns:wpg="http://schemas.microsoft.com/office/word/2010/wordprocessingGroup" xmlns:wpi="http://schemas.microsoft.com/office/word/2010/wordprocessingInk" xmlns:wne="http://schemas.microsoft.com/office/word/2006/wordml" xmlns:wps="http://schemas.microsoft.com/office/word/2010/wordprocessingShape" mc:Ignorable="w14 wp14">
   <w:body>
+    <w:tbl>
+      <w:tblPr>
+        <w:tblW w:type="auto" w:w="0"/>
+        <w:tblLayout w:type="fixed"/>
+        <w:tblLook w:firstColumn="1" w:firstRow="1" w:lastColumn="0" w:lastRow="0" w:noHBand="0" w:noVBand="1" w:val="04A0"/>
+        <w:tblBorders>
+          <w:top w:val="nil"/>
+          <w:left w:val="nil"/>
+          <w:bottom w:val="nil"/>
+          <w:right w:val="nil"/>
+          <w:insideH w:val="nil"/>
+          <w:insideV w:val="nil"/>
+        </w:tblBorders>
+      </w:tblPr>
+      <w:tblGrid>
+        <w:gridCol w:w="6768"/>
+        <w:gridCol w:w="504"/>
+        <w:gridCol w:w="2232"/>
+      </w:tblGrid>
+      <w:tr>
+        <w:tc>
+          <w:tcPr>
+            <w:tcW w:type="dxa" w:w="6768"/>
+          </w:tcPr>
+          <w:p>
+            <w:pPr>
+              <w:pStyle w:val="Title"/>
+            </w:pPr>
+            <w:r>
+              <w:t>Buchungsbestätigung</w:t>
+            </w:r>
+          </w:p>
+        </w:tc>
+        <w:tc>
+          <w:tcPr>
+            <w:tcW w:type="dxa" w:w="504"/>
+          </w:tcPr>
+          <w:p/>
+        </w:tc>
+        <w:tc>
+          <w:tcPr>
+            <w:tcW w:type="dxa" w:w="2232"/>
+          </w:tcPr>
+          <w:p>
+            <w:pPr>
+              <w:jc w:val="center"/>
+            </w:pPr>
+            <w:r>
+              <w:drawing>
+                <wp:inline xmlns:a="http://schemas.openxmlformats.org/drawingml/2006/main" xmlns:pic="http://schemas.openxmlformats.org/drawingml/2006/picture">
+                  <wp:extent cx="1280160" cy="828682"/>
+                  <wp:docPr id="1" name="Picture 1"/>
+                  <wp:cNvGraphicFramePr>
+                    <a:graphicFrameLocks noChangeAspect="1"/>
+                  </wp:cNvGraphicFramePr>
+                  <a:graphic>
+                    <a:graphicData uri="http://schemas.openxmlformats.org/drawingml/2006/picture">
+                      <pic:pic>
+                        <pic:nvPicPr>
+                          <pic:cNvPr id="0" name="image.png"/>
+                          <pic:cNvPicPr/>
+                        </pic:nvPicPr>
+                        <pic:blipFill>
+                          <a:blip r:embed="rId9"/>
+                          <a:stretch>
+                            <a:fillRect/>
+                          </a:stretch>
+                        </pic:blipFill>
+                        <pic:spPr>
+                          <a:xfrm>
+                            <a:off x="0" y="0"/>
+                            <a:ext cx="1280160" cy="828682"/>
+                          </a:xfrm>
+                          <a:prstGeom prst="rect"/>
+                        </pic:spPr>
+                      </pic:pic>
+                    </a:graphicData>
+                  </a:graphic>
+                </wp:inline>
+              </w:drawing>
+            </w:r>
+          </w:p>
+        </w:tc>
+      </w:tr>
+    </w:tbl>
     <w:p>
       <w:pPr>
-        <w:jc w:val="center"/>
-        <w:shd w:fill="111111"/>
+        <w:spacing w:after="480"/>
+      </w:pPr>
+    </w:p>
+    <w:p>
+      <w:r>
+        <w:rPr>
+          <w:sz w:val="14"/>
+        </w:rPr>
+        <w:t>White-Gloss Detailing - Lars Marco Hägele · Arnistal 27 · 72160 Horb (Dettingen)</w:t>
+      </w:r>
+    </w:p>
+    <w:tbl>
+      <w:tblPr>
+        <w:tblW w:type="auto" w:w="0"/>
+        <w:tblLook w:firstColumn="1" w:firstRow="1" w:lastColumn="0" w:lastRow="0" w:noHBand="0" w:noVBand="1" w:val="04A0"/>
+        <w:tblBorders>
+          <w:top w:val="nil"/>
+          <w:left w:val="nil"/>
+          <w:bottom w:val="nil"/>
+          <w:right w:val="nil"/>
+          <w:insideH w:val="nil"/>
+          <w:insideV w:val="nil"/>
+        </w:tblBorders>
+      </w:tblPr>
+      <w:tblGrid>
+        <w:gridCol w:w="4802"/>
+        <w:gridCol w:w="4802"/>
+      </w:tblGrid>
+      <w:tr>
+        <w:tc>
+          <w:tcPr>
+            <w:tcW w:type="dxa" w:w="4802"/>
+          </w:tcPr>
+          <w:p>
+            <w:r>
+              <w:t>{WGCustomerName}</w:t>
+              <w:br/>
+              <w:t>{WGCustomerAddress}</w:t>
+            </w:r>
+          </w:p>
+          <w:p>
+            <w:r>
+              <w:t>{WGCustomerEmail}</w:t>
+              <w:br/>
+              <w:t>{WGCustomerPhone}</w:t>
+            </w:r>
+          </w:p>
+        </w:tc>
+        <w:tc>
+          <w:tcPr>
+            <w:tcW w:type="dxa" w:w="4802"/>
+          </w:tcPr>
+          <w:p>
+            <w:r>
+              <w:t>Buchungsreferenz: {WGReference}</w:t>
+              <w:br/>
+              <w:t>Ausgestellt am: {WGIssuedOn}</w:t>
+            </w:r>
+          </w:p>
+        </w:tc>
+      </w:tr>
+    </w:tbl>
+    <w:p/>
+    <w:p>
+      <w:r>
+        <w:t>Vielen Dank für deine Buchung. Nach unserer Prüfung bestätigen wir die folgenden Leistungen und den vereinbarten Termin:</w:t>
+      </w:r>
+    </w:p>
+    <w:p>
+      <w:r>
+        <w:t>Fahrzeug: {WGVehicle} · Kennzeichen: {WGPlate}</w:t>
+      </w:r>
+    </w:p>
+    <w:tbl>
+      <w:tblPr>
+        <w:tblStyle w:val="TableGrid"/>
+        <w:tblW w:type="auto" w:w="0"/>
+        <w:tblLayout w:type="fixed"/>
+        <w:tblLook w:firstColumn="1" w:firstRow="1" w:lastColumn="0" w:lastRow="0" w:noHBand="0" w:noVBand="1" w:val="04A0"/>
+        <w:tblBorders>
+          <w:top w:val="nil"/>
+          <w:left w:val="nil"/>
+          <w:bottom w:val="nil"/>
+          <w:right w:val="nil"/>
+          <w:insideH w:val="nil"/>
+          <w:insideV w:val="nil"/>
+        </w:tblBorders>
+      </w:tblPr>
+      <w:tblGrid>
+        <w:gridCol w:w="4392"/>
+        <w:gridCol w:w="936"/>
+        <w:gridCol w:w="1440"/>
+        <w:gridCol w:w="1008"/>
+        <w:gridCol w:w="1728"/>
+      </w:tblGrid>
+      <w:tr>
+        <w:tc>
+          <w:tcPr>
+            <w:tcW w:type="dxa" w:w="4392"/>
+            <w:shd w:fill="202020"/>
+          </w:tcPr>
+          <w:p>
+            <w:r>
+              <w:rPr>
+                <w:b/>
+                <w:color w:val="FFFFFF"/>
+              </w:rPr>
+              <w:t>Beschreibung</w:t>
+            </w:r>
+          </w:p>
+        </w:tc>
+        <w:tc>
+          <w:tcPr>
+            <w:tcW w:type="dxa" w:w="936"/>
+            <w:shd w:fill="202020"/>
+          </w:tcPr>
+          <w:p>
+            <w:r>
+              <w:rPr>
+                <w:b/>
+                <w:color w:val="FFFFFF"/>
+              </w:rPr>
+              <w:t>Menge</w:t>
+            </w:r>
+          </w:p>
+        </w:tc>
+        <w:tc>
+          <w:tcPr>
+            <w:tcW w:type="dxa" w:w="1440"/>
+            <w:shd w:fill="202020"/>
+          </w:tcPr>
+          <w:p>
+            <w:r>
+              <w:rPr>
+                <w:b/>
+                <w:color w:val="FFFFFF"/>
+              </w:rPr>
+              <w:t>Einzelpreis</w:t>
+            </w:r>
+          </w:p>
+        </w:tc>
+        <w:tc>
+          <w:tcPr>
+            <w:tcW w:type="dxa" w:w="1008"/>
+            <w:shd w:fill="202020"/>
+          </w:tcPr>
+          <w:p>
+            <w:r>
+              <w:rPr>
+                <w:b/>
+                <w:color w:val="FFFFFF"/>
+              </w:rPr>
+              <w:t>MwSt.</w:t>
+            </w:r>
+          </w:p>
+        </w:tc>
+        <w:tc>
+          <w:tcPr>
+            <w:tcW w:type="dxa" w:w="1728"/>
+            <w:shd w:fill="202020"/>
+          </w:tcPr>
+          <w:p>
+            <w:r>
+              <w:rPr>
+                <w:b/>
+                <w:color w:val="FFFFFF"/>
+              </w:rPr>
+              <w:t>Nettobetrag</w:t>
+            </w:r>
+          </w:p>
+        </w:tc>
+      </w:tr>
+      <w:tr>
+        <w:tc>
+          <w:tcPr>
+            <w:tcW w:type="dxa" w:w="4392"/>
+          </w:tcPr>
+          <w:p>
+            <w:r>
+              <w:t>{WGServiceLines}</w:t>
+            </w:r>
+          </w:p>
+        </w:tc>
+        <w:tc>
+          <w:tcPr>
+            <w:tcW w:type="dxa" w:w="936"/>
+          </w:tcPr>
+          <w:p>
+            <w:r>
+              <w:t>{Qty}</w:t>
+            </w:r>
+          </w:p>
+        </w:tc>
+        <w:tc>
+          <w:tcPr>
+            <w:tcW w:type="dxa" w:w="1440"/>
+          </w:tcPr>
+          <w:p>
+            <w:r>
+              <w:t>{UnitNet}</w:t>
+            </w:r>
+          </w:p>
+        </w:tc>
+        <w:tc>
+          <w:tcPr>
+            <w:tcW w:type="dxa" w:w="1008"/>
+          </w:tcPr>
+          <w:p>
+            <w:r>
+              <w:t>19 %</w:t>
+            </w:r>
+          </w:p>
+        </w:tc>
+        <w:tc>
+          <w:tcPr>
+            <w:tcW w:type="dxa" w:w="1728"/>
+          </w:tcPr>
+          <w:p>
+            <w:r>
+              <w:t>{LineNet}</w:t>
+            </w:r>
+          </w:p>
+        </w:tc>
+      </w:tr>
+    </w:tbl>
+    <w:p>
+      <w:pPr>
+        <w:jc w:val="right"/>
       </w:pPr>
       <w:r>
-        <w:drawing>
-          <wp:inline xmlns:a="http://schemas.openxmlformats.org/drawingml/2006/main" xmlns:pic="http://schemas.openxmlformats.org/drawingml/2006/picture">
-            <wp:extent cx="2286000" cy="1479788"/>
-            <wp:docPr id="1" name="Picture 1"/>
-            <wp:cNvGraphicFramePr>
-              <a:graphicFrameLocks noChangeAspect="1"/>
-            </wp:cNvGraphicFramePr>
-            <a:graphic>
-              <a:graphicData uri="http://schemas.openxmlformats.org/drawingml/2006/picture">
-                <pic:pic>
-                  <pic:nvPicPr>
-                    <pic:cNvPr id="0" name="image.png"/>
-                    <pic:cNvPicPr/>
-                  </pic:nvPicPr>
-                  <pic:blipFill>
-                    <a:blip r:embed="rId9"/>
-                    <a:stretch>
-                      <a:fillRect/>
-                    </a:stretch>
-                  </pic:blipFill>
-                  <pic:spPr>
-                    <a:xfrm>
-                      <a:off x="0" y="0"/>
-                      <a:ext cx="2286000" cy="1479788"/>
-                    </a:xfrm>
-                    <a:prstGeom prst="rect"/>
-                  </pic:spPr>
-                </pic:pic>
-              </a:graphicData>
-            </a:graphic>
-          </wp:inline>
-        </w:drawing>
+        <w:t>Nettobetrag: {WGNetTotal}</w:t>
       </w:r>
     </w:p>
     <w:p>
       <w:pPr>
-        <w:pStyle w:val="Title"/>
+        <w:jc w:val="right"/>
       </w:pPr>
       <w:r>
-        <w:t>Buchungsbestätigung</w:t>
-      </w:r>
-    </w:p>
-    <w:p>
-      <w:r>
-        <w:rPr>
-          <w:sz w:val="16"/>
-        </w:rPr>
-        <w:t>White Gloss Detailing · Lars Hägele</w:t>
-        <w:br/>
-        <w:t>Arnistal 27 · 72160 Horb am Neckar</w:t>
-      </w:r>
-    </w:p>
-    <w:p>
-      <w:r>
-        <w:t>Buchungsreferenz {WGReference}   ·   Ausgestellt am {WGIssuedOn}</w:t>
-      </w:r>
-    </w:p>
-    <w:p>
-      <w:r>
-        <w:t>{WGCustomerName}</w:t>
-        <w:br/>
-        <w:t>{WGCustomerAddress}</w:t>
-        <w:br/>
-        <w:t>{WGCustomerEmail} · {WGCustomerPhone}</w:t>
-      </w:r>
-    </w:p>
-    <w:p>
-      <w:r>
-        <w:t>Vielen Dank für deine Buchung. Nach unserer Prüfung bestätigen wir die folgenden Leistungen und den vereinbarten Termin.</w:t>
+        <w:t>MwSt. 19 %: {WGVatTotal}</w:t>
       </w:r>
     </w:p>
     <w:p>
       <w:pPr>
-        <w:pStyle w:val="Heading2"/>
+        <w:ind w:left="4320"/>
+        <w:jc w:val="right"/>
+        <w:shd w:fill="F3F3F3"/>
       </w:pPr>
-      <w:r>
-        <w:t>Fahrzeug</w:t>
-      </w:r>
-    </w:p>
-    <w:p>
-      <w:r>
-        <w:t>{WGVehicle}</w:t>
-        <w:br/>
-        <w:t>Kennzeichen {WGPlate}</w:t>
-      </w:r>
-    </w:p>
-    <w:p>
-      <w:pPr>
-        <w:pStyle w:val="Heading2"/>
-      </w:pPr>
-      <w:r>
-        <w:t>Bestätigte Leistungen</w:t>
-      </w:r>
-    </w:p>
-    <w:p>
-      <w:r>
-        <w:t>{WGServiceLines}</w:t>
-      </w:r>
-    </w:p>
-    <w:p>
-      <w:r>
-        <w:t xml:space="preserve">Endgültig vereinbarter Gesamtpreis: </w:t>
-      </w:r>
       <w:r>
         <w:rPr>
           <w:b/>
         </w:rPr>
-        <w:t>{WGAgreedPrice}</w:t>
-      </w:r>
-    </w:p>
-    <w:p>
-      <w:pPr>
-        <w:pStyle w:val="Heading2"/>
-      </w:pPr>
-      <w:r>
-        <w:t>Vereinbarter Zeitraum</w:t>
+        <w:t>Gesamtbetrag inkl. MwSt.: {WGGrossTotal}</w:t>
       </w:r>
     </w:p>
     <w:p>
@@ -138,30 +355,26 @@
       </w:r>
     </w:p>
     <w:p>
-      <w:pPr>
-        <w:pStyle w:val="Heading2"/>
-      </w:pPr>
       <w:r>
-        <w:t>Hinweise</w:t>
+        <w:t>Hinweise: {WGNotes}</w:t>
       </w:r>
     </w:p>
     <w:p>
       <w:r>
-        <w:t>{WGNotes}</w:t>
+        <w:t>Vielen Dank für die gute Zusammenarbeit.</w:t>
+        <w:br/>
+        <w:t>White-Gloss Detailing</w:t>
       </w:r>
     </w:p>
     <w:p>
       <w:r>
-        <w:rPr>
-          <w:sz w:val="18"/>
-        </w:rPr>
         <w:t>Diese Buchungsbestätigung ist keine Rechnung. Die Rechnung wird nach der Durchführung der Dienstleistung separat erstellt.</w:t>
       </w:r>
     </w:p>
     <w:sectPr>
       <w:footerReference w:type="default" r:id="rId10"/>
       <w:pgSz w:w="11909" w:h="16834"/>
-      <w:pgMar w:top="936" w:right="1224" w:bottom="936" w:left="1224" w:header="720" w:footer="720" w:gutter="0"/>
+      <w:pgMar w:top="1008" w:right="1152" w:bottom="1152" w:left="1152" w:header="720" w:footer="720" w:gutter="0"/>
       <w:cols w:space="720"/>
       <w:docGrid w:linePitch="360"/>
     </w:sectPr>
@@ -175,13 +388,59 @@
     <w:pPr>
       <w:pStyle w:val="Footer"/>
     </w:pPr>
-    <w:r>
-      <w:rPr>
-        <w:sz w:val="16"/>
-      </w:rPr>
-      <w:t>White Gloss Detailing · buchung@white-gloss.de · white-gloss.de</w:t>
-    </w:r>
   </w:p>
+  <w:tbl>
+    <w:tblPr>
+      <w:tblW w:type="auto" w:w="0"/>
+      <w:tblLook w:firstColumn="1" w:firstRow="1" w:lastColumn="0" w:lastRow="0" w:noHBand="0" w:noVBand="1" w:val="04A0"/>
+      <w:tblBorders>
+        <w:top w:val="nil"/>
+        <w:left w:val="nil"/>
+        <w:bottom w:val="nil"/>
+        <w:right w:val="nil"/>
+        <w:insideH w:val="nil"/>
+        <w:insideV w:val="nil"/>
+      </w:tblBorders>
+    </w:tblPr>
+    <w:tblGrid>
+      <w:gridCol w:w="4752"/>
+      <w:gridCol w:w="4752"/>
+    </w:tblGrid>
+    <w:tr>
+      <w:tc>
+        <w:tcPr>
+          <w:tcW w:type="dxa" w:w="4752"/>
+        </w:tcPr>
+        <w:p>
+          <w:r>
+            <w:rPr>
+              <w:sz w:val="14"/>
+            </w:rPr>
+            <w:t>White-Gloss Detailing - Lars Marco Hägele</w:t>
+            <w:br/>
+            <w:t>Arnistal 27 · 72160 Horb (Dettingen), DE</w:t>
+            <w:br/>
+            <w:t>buchung@white-gloss.de</w:t>
+          </w:r>
+        </w:p>
+      </w:tc>
+      <w:tc>
+        <w:tcPr>
+          <w:tcW w:type="dxa" w:w="4752"/>
+        </w:tcPr>
+        <w:p>
+          <w:r>
+            <w:rPr>
+              <w:sz w:val="14"/>
+            </w:rPr>
+            <w:t>white-gloss.de</w:t>
+            <w:br/>
+            <w:t>Buchungsreferenz {WGReference}</w:t>
+          </w:r>
+        </w:p>
+      </w:tc>
+    </w:tr>
+  </w:tbl>
 </w:ftr>
 </file>
 
@@ -549,11 +808,11 @@
     <w:qFormat/>
     <w:rsid w:val="00FC693F"/>
     <w:pPr>
-      <w:spacing w:after="140"/>
+      <w:spacing w:after="120"/>
     </w:pPr>
     <w:rPr>
       <w:rFonts w:ascii="Arial" w:hAnsi="Arial"/>
-      <w:sz w:val="20"/>
+      <w:sz w:val="18"/>
     </w:rPr>
   </w:style>
   <w:style w:type="paragraph" w:styleId="Header">
@@ -905,7 +1164,7 @@
       <w:color w:val="000000"/>
       <w:spacing w:val="5"/>
       <w:kern w:val="28"/>
-      <w:sz w:val="52"/>
+      <w:sz w:val="40"/>
       <w:szCs w:val="52"/>
     </w:rPr>
   </w:style>

</xml_diff>

<commit_message>
feat: bind Bitrix document values and prepare isolated IONOS mail adapter
</commit_message>
<xml_diff>
--- a/docs/bitrix/templates/buchungsbestaetigung.docx
+++ b/docs/bitrix/templates/buchungsbestaetigung.docx
@@ -123,16 +123,35 @@
             <w:tcW w:type="dxa" w:w="4802"/>
           </w:tcPr>
           <w:p>
+            <w:pPr>
+              <w:spacing w:after="40"/>
+            </w:pPr>
+            <w:r/>
             <w:r>
               <w:t>{WGCustomerName}</w:t>
-              <w:br/>
+            </w:r>
+          </w:p>
+          <w:p>
+            <w:pPr>
+              <w:spacing w:after="40"/>
+            </w:pPr>
+            <w:r>
               <w:t>{WGCustomerAddress}</w:t>
             </w:r>
           </w:p>
           <w:p>
+            <w:pPr>
+              <w:spacing w:after="40"/>
+            </w:pPr>
             <w:r>
               <w:t>{WGCustomerEmail}</w:t>
-              <w:br/>
+            </w:r>
+          </w:p>
+          <w:p>
+            <w:pPr>
+              <w:spacing w:after="40"/>
+            </w:pPr>
+            <w:r>
               <w:t>{WGCustomerPhone}</w:t>
             </w:r>
           </w:p>
@@ -142,9 +161,19 @@
             <w:tcW w:type="dxa" w:w="4802"/>
           </w:tcPr>
           <w:p>
+            <w:pPr>
+              <w:spacing w:after="40"/>
+            </w:pPr>
+            <w:r/>
             <w:r>
               <w:t>Buchungsreferenz: {WGReference}</w:t>
-              <w:br/>
+            </w:r>
+          </w:p>
+          <w:p>
+            <w:pPr>
+              <w:spacing w:after="40"/>
+            </w:pPr>
+            <w:r>
               <w:t>Ausgestellt am: {WGIssuedOn}</w:t>
             </w:r>
           </w:p>
@@ -344,13 +373,34 @@
       </w:r>
     </w:p>
     <w:p>
+      <w:pPr>
+        <w:spacing w:after="40"/>
+      </w:pPr>
       <w:r>
         <w:t>Beginn: {WGStart}</w:t>
-        <w:br/>
+      </w:r>
+    </w:p>
+    <w:p>
+      <w:pPr>
+        <w:spacing w:after="40"/>
+      </w:pPr>
+      <w:r>
         <w:t>Ende: {WGEnd}</w:t>
-        <w:br/>
+      </w:r>
+    </w:p>
+    <w:p>
+      <w:pPr>
+        <w:spacing w:after="40"/>
+      </w:pPr>
+      <w:r>
         <w:t>Vereinbarte Dauer: {WGDuration}</w:t>
-        <w:br/>
+      </w:r>
+    </w:p>
+    <w:p>
+      <w:pPr>
+        <w:spacing w:after="40"/>
+      </w:pPr>
+      <w:r>
         <w:t>Leistungsort: {WGLocation}</w:t>
       </w:r>
     </w:p>
@@ -412,14 +462,40 @@
           <w:tcW w:type="dxa" w:w="4752"/>
         </w:tcPr>
         <w:p>
+          <w:pPr>
+            <w:spacing w:after="40"/>
+          </w:pPr>
+          <w:r>
+            <w:rPr>
+              <w:sz w:val="14"/>
+            </w:rPr>
+          </w:r>
           <w:r>
             <w:rPr>
               <w:sz w:val="14"/>
             </w:rPr>
             <w:t>White-Gloss Detailing - Lars Marco Hägele</w:t>
-            <w:br/>
+          </w:r>
+        </w:p>
+        <w:p>
+          <w:pPr>
+            <w:spacing w:after="40"/>
+          </w:pPr>
+          <w:r>
+            <w:rPr>
+              <w:sz w:val="14"/>
+            </w:rPr>
             <w:t>Arnistal 27 · 72160 Horb (Dettingen), DE</w:t>
-            <w:br/>
+          </w:r>
+        </w:p>
+        <w:p>
+          <w:pPr>
+            <w:spacing w:after="40"/>
+          </w:pPr>
+          <w:r>
+            <w:rPr>
+              <w:sz w:val="14"/>
+            </w:rPr>
             <w:t>buchung@white-gloss.de</w:t>
           </w:r>
         </w:p>
@@ -429,12 +505,29 @@
           <w:tcW w:type="dxa" w:w="4752"/>
         </w:tcPr>
         <w:p>
+          <w:pPr>
+            <w:spacing w:after="40"/>
+          </w:pPr>
+          <w:r>
+            <w:rPr>
+              <w:sz w:val="14"/>
+            </w:rPr>
+          </w:r>
           <w:r>
             <w:rPr>
               <w:sz w:val="14"/>
             </w:rPr>
             <w:t>white-gloss.de</w:t>
-            <w:br/>
+          </w:r>
+        </w:p>
+        <w:p>
+          <w:pPr>
+            <w:spacing w:after="40"/>
+          </w:pPr>
+          <w:r>
+            <w:rPr>
+              <w:sz w:val="14"/>
+            </w:rPr>
             <w:t>Buchungsreferenz {WGReference}</w:t>
           </w:r>
         </w:p>

</xml_diff>